<commit_message>
chore: update resume docs
</commit_message>
<xml_diff>
--- a/public/resume.docx
+++ b/public/resume.docx
@@ -299,16 +299,20 @@
     <w:p>
       <w:pPr>
         <w:spacing w:line="240" w:lineRule="auto"/>
-        <w:rPr/>
-      </w:pPr>
-      <w:r>
-        <w:rPr>
-          <w:rFonts w:ascii="Helvetica Neue" w:cs="Helvetica Neue" w:eastAsia="Helvetica Neue" w:hAnsi="Helvetica Neue"/>
-          <w:sz w:val="24"/>
-          <w:szCs w:val="24"/>
-          <w:rtl w:val="0"/>
-        </w:rPr>
-        <w:t xml:space="preserve">Full-Stack Software Engineer (Web, Backend), Overview — Dec 2023 </w:t>
+        <w:rPr>
+          <w:rFonts w:ascii="Helvetica Neue" w:cs="Helvetica Neue" w:eastAsia="Helvetica Neue" w:hAnsi="Helvetica Neue"/>
+          <w:sz w:val="24"/>
+          <w:szCs w:val="24"/>
+        </w:rPr>
+      </w:pPr>
+      <w:r>
+        <w:rPr>
+          <w:rFonts w:ascii="Helvetica Neue" w:cs="Helvetica Neue" w:eastAsia="Helvetica Neue" w:hAnsi="Helvetica Neue"/>
+          <w:sz w:val="24"/>
+          <w:szCs w:val="24"/>
+          <w:rtl w:val="0"/>
+        </w:rPr>
+        <w:t xml:space="preserve">Full-Stack Software Engineer, DPD Framework — Apr 2025 </w:t>
       </w:r>
       <w:r>
         <w:rPr>
@@ -328,51 +332,79 @@
         </w:rPr>
         <w:t xml:space="preserve"> Present</w:t>
       </w:r>
-      <w:r>
-        <w:rPr>
-          <w:rtl w:val="0"/>
-        </w:rPr>
-      </w:r>
-    </w:p>
-    <w:p>
-      <w:pPr>
-        <w:spacing w:line="276" w:lineRule="auto"/>
-        <w:rPr>
-          <w:rFonts w:ascii="Helvetica Neue Light" w:cs="Helvetica Neue Light" w:eastAsia="Helvetica Neue Light" w:hAnsi="Helvetica Neue Light"/>
-          <w:color w:val="434343"/>
-        </w:rPr>
-      </w:pPr>
-      <w:r>
-        <w:rPr>
-          <w:rFonts w:ascii="Helvetica Neue Light" w:cs="Helvetica Neue Light" w:eastAsia="Helvetica Neue Light" w:hAnsi="Helvetica Neue Light"/>
-          <w:color w:val="434343"/>
-          <w:rtl w:val="0"/>
-        </w:rPr>
-        <w:t xml:space="preserve"> • Architected a modern Next.js platform using SSG, ISR, and SSR to optimize performance and cost</w:t>
-        <w:br w:type="textWrapping"/>
-        <w:t xml:space="preserve">• Conceived, architected, and implemented digital editor in chief that resulted in an increase of 30% in user engagement</w:t>
-      </w:r>
-    </w:p>
-    <w:p>
-      <w:pPr>
-        <w:spacing w:line="276" w:lineRule="auto"/>
-        <w:rPr>
-          <w:rFonts w:ascii="Helvetica Neue Light" w:cs="Helvetica Neue Light" w:eastAsia="Helvetica Neue Light" w:hAnsi="Helvetica Neue Light"/>
-          <w:color w:val="434343"/>
-        </w:rPr>
-      </w:pPr>
-      <w:r>
-        <w:rPr>
-          <w:rFonts w:ascii="Helvetica Neue Light" w:cs="Helvetica Neue Light" w:eastAsia="Helvetica Neue Light" w:hAnsi="Helvetica Neue Light"/>
-          <w:color w:val="434343"/>
-          <w:rtl w:val="0"/>
-        </w:rPr>
-        <w:t xml:space="preserve">• Built internal tooling (Next.js/React) that improved observability and cut debugging time by 50%</w:t>
-      </w:r>
-    </w:p>
-    <w:p>
-      <w:pPr>
-        <w:spacing w:line="276" w:lineRule="auto"/>
+    </w:p>
+    <w:p>
+      <w:pPr>
+        <w:spacing w:line="240" w:lineRule="auto"/>
+        <w:rPr>
+          <w:rFonts w:ascii="Helvetica Neue" w:cs="Helvetica Neue" w:eastAsia="Helvetica Neue" w:hAnsi="Helvetica Neue"/>
+          <w:color w:val="434343"/>
+          <w:sz w:val="24"/>
+          <w:szCs w:val="24"/>
+        </w:rPr>
+      </w:pPr>
+      <w:r>
+        <w:rPr>
+          <w:rFonts w:ascii="Helvetica Neue" w:cs="Helvetica Neue" w:eastAsia="Helvetica Neue" w:hAnsi="Helvetica Neue"/>
+          <w:color w:val="434343"/>
+          <w:sz w:val="24"/>
+          <w:szCs w:val="24"/>
+          <w:rtl w:val="0"/>
+        </w:rPr>
+        <w:t xml:space="preserve">Contract Position</w:t>
+      </w:r>
+    </w:p>
+    <w:p>
+      <w:pPr>
+        <w:rPr>
+          <w:rFonts w:ascii="Helvetica Neue Light" w:cs="Helvetica Neue Light" w:eastAsia="Helvetica Neue Light" w:hAnsi="Helvetica Neue Light"/>
+          <w:color w:val="434343"/>
+        </w:rPr>
+      </w:pPr>
+      <w:r>
+        <w:rPr>
+          <w:rFonts w:ascii="Helvetica Neue Light" w:cs="Helvetica Neue Light" w:eastAsia="Helvetica Neue Light" w:hAnsi="Helvetica Neue Light"/>
+          <w:color w:val="434343"/>
+          <w:rtl w:val="0"/>
+        </w:rPr>
+        <w:t xml:space="preserve">• Implemented 3D custom user interfaces using React Native, Reanimated, and React Three Fiber</w:t>
+      </w:r>
+    </w:p>
+    <w:p>
+      <w:pPr>
+        <w:rPr>
+          <w:rFonts w:ascii="Helvetica Neue Light" w:cs="Helvetica Neue Light" w:eastAsia="Helvetica Neue Light" w:hAnsi="Helvetica Neue Light"/>
+          <w:color w:val="434343"/>
+        </w:rPr>
+      </w:pPr>
+      <w:r>
+        <w:rPr>
+          <w:rFonts w:ascii="Helvetica Neue Light" w:cs="Helvetica Neue Light" w:eastAsia="Helvetica Neue Light" w:hAnsi="Helvetica Neue Light"/>
+          <w:color w:val="434343"/>
+          <w:rtl w:val="0"/>
+        </w:rPr>
+        <w:t xml:space="preserve">• Designed scalable Firebase data structures to support multi-tier professional organizations and fast data delivery</w:t>
+      </w:r>
+    </w:p>
+    <w:p>
+      <w:pPr>
+        <w:rPr>
+          <w:rFonts w:ascii="Helvetica Neue Light" w:cs="Helvetica Neue Light" w:eastAsia="Helvetica Neue Light" w:hAnsi="Helvetica Neue Light"/>
+          <w:color w:val="434343"/>
+        </w:rPr>
+      </w:pPr>
+      <w:r>
+        <w:rPr>
+          <w:rFonts w:ascii="Helvetica Neue Light" w:cs="Helvetica Neue Light" w:eastAsia="Helvetica Neue Light" w:hAnsi="Helvetica Neue Light"/>
+          <w:color w:val="434343"/>
+          <w:rtl w:val="0"/>
+        </w:rPr>
+        <w:t xml:space="preserve">• Cut operational workload by 90%+ via automation pipelines and internal tooling</w:t>
+      </w:r>
+    </w:p>
+    <w:p>
+      <w:pPr>
+        <w:spacing w:line="240" w:lineRule="auto"/>
         <w:rPr>
           <w:color w:val="a64d79"/>
           <w:sz w:val="30"/>
@@ -382,18 +414,108 @@
       </w:pPr>
       <w:r>
         <w:rPr>
-          <w:rFonts w:ascii="Helvetica Neue Light" w:cs="Helvetica Neue Light" w:eastAsia="Helvetica Neue Light" w:hAnsi="Helvetica Neue Light"/>
-          <w:color w:val="434343"/>
-          <w:rtl w:val="0"/>
-        </w:rPr>
-        <w:t xml:space="preserve">• Researched and implemented translation optimizations resulting in 90% reduction in operating cost while improving translation quality with Node.js</w:t>
-      </w:r>
-      <w:r>
+          <w:rtl w:val="0"/>
+        </w:rPr>
+      </w:r>
+    </w:p>
+    <w:p>
+      <w:pPr>
+        <w:spacing w:line="240" w:lineRule="auto"/>
+        <w:rPr/>
+      </w:pPr>
+      <w:r>
+        <w:rPr>
+          <w:rFonts w:ascii="Helvetica Neue" w:cs="Helvetica Neue" w:eastAsia="Helvetica Neue" w:hAnsi="Helvetica Neue"/>
+          <w:sz w:val="24"/>
+          <w:szCs w:val="24"/>
+          <w:rtl w:val="0"/>
+        </w:rPr>
+        <w:t xml:space="preserve">Full-Stack Software Engineer, Overview — Dec 2023 </w:t>
+      </w:r>
+      <w:r>
+        <w:rPr>
+          <w:rFonts w:ascii="Helvetica Neue" w:cs="Helvetica Neue" w:eastAsia="Helvetica Neue" w:hAnsi="Helvetica Neue"/>
+          <w:sz w:val="20"/>
+          <w:szCs w:val="20"/>
+          <w:rtl w:val="0"/>
+        </w:rPr>
+        <w:t xml:space="preserve">•</w:t>
+      </w:r>
+      <w:r>
+        <w:rPr>
+          <w:rFonts w:ascii="Helvetica Neue" w:cs="Helvetica Neue" w:eastAsia="Helvetica Neue" w:hAnsi="Helvetica Neue"/>
+          <w:sz w:val="24"/>
+          <w:szCs w:val="24"/>
+          <w:rtl w:val="0"/>
+        </w:rPr>
+        <w:t xml:space="preserve"> Apr 2025</w:t>
+      </w:r>
+      <w:r>
+        <w:rPr>
+          <w:rtl w:val="0"/>
+        </w:rPr>
+      </w:r>
+    </w:p>
+    <w:p>
+      <w:pPr>
+        <w:spacing w:line="276" w:lineRule="auto"/>
+        <w:rPr>
+          <w:rFonts w:ascii="Helvetica Neue Light" w:cs="Helvetica Neue Light" w:eastAsia="Helvetica Neue Light" w:hAnsi="Helvetica Neue Light"/>
+          <w:color w:val="434343"/>
+        </w:rPr>
+      </w:pPr>
+      <w:r>
+        <w:rPr>
+          <w:rFonts w:ascii="Helvetica Neue Light" w:cs="Helvetica Neue Light" w:eastAsia="Helvetica Neue Light" w:hAnsi="Helvetica Neue Light"/>
+          <w:color w:val="434343"/>
+          <w:rtl w:val="0"/>
+        </w:rPr>
+        <w:t xml:space="preserve"> • Architected a modern Next.js platform using SSG, ISR, and SSR to optimize performance and cost</w:t>
+        <w:br w:type="textWrapping"/>
+        <w:t xml:space="preserve">• Conceived, architected, and implemented digital editor in chief that resulted in an increase of 30% in user engagement</w:t>
+      </w:r>
+    </w:p>
+    <w:p>
+      <w:pPr>
+        <w:spacing w:line="276" w:lineRule="auto"/>
+        <w:rPr>
+          <w:rFonts w:ascii="Helvetica Neue Light" w:cs="Helvetica Neue Light" w:eastAsia="Helvetica Neue Light" w:hAnsi="Helvetica Neue Light"/>
+          <w:color w:val="434343"/>
+        </w:rPr>
+      </w:pPr>
+      <w:r>
+        <w:rPr>
+          <w:rFonts w:ascii="Helvetica Neue Light" w:cs="Helvetica Neue Light" w:eastAsia="Helvetica Neue Light" w:hAnsi="Helvetica Neue Light"/>
+          <w:color w:val="434343"/>
+          <w:rtl w:val="0"/>
+        </w:rPr>
+        <w:t xml:space="preserve">• Built internal tooling (Next.js/React) that improved observability and cut debugging time by 50%</w:t>
+      </w:r>
+    </w:p>
+    <w:p>
+      <w:pPr>
+        <w:spacing w:line="276" w:lineRule="auto"/>
         <w:rPr>
           <w:color w:val="a64d79"/>
           <w:sz w:val="30"/>
           <w:szCs w:val="30"/>
           <w:u w:val="single"/>
+        </w:rPr>
+      </w:pPr>
+      <w:r>
+        <w:rPr>
+          <w:rFonts w:ascii="Helvetica Neue Light" w:cs="Helvetica Neue Light" w:eastAsia="Helvetica Neue Light" w:hAnsi="Helvetica Neue Light"/>
+          <w:color w:val="434343"/>
+          <w:rtl w:val="0"/>
+        </w:rPr>
+        <w:t xml:space="preserve">• Researched and implemented translation optimizations resulting in 90% reduction in operating cost while improving translation quality with Node.js</w:t>
+      </w:r>
+      <w:r>
+        <w:rPr>
+          <w:color w:val="a64d79"/>
+          <w:sz w:val="30"/>
+          <w:szCs w:val="30"/>
+          <w:u w:val="single"/>
           <w:rtl w:val="0"/>
         </w:rPr>
         <w:br w:type="textWrapping"/>
@@ -403,218 +525,102 @@
       <w:pPr>
         <w:spacing w:line="240" w:lineRule="auto"/>
         <w:rPr>
-          <w:rFonts w:ascii="Helvetica Neue" w:cs="Helvetica Neue" w:eastAsia="Helvetica Neue" w:hAnsi="Helvetica Neue"/>
-          <w:sz w:val="24"/>
-          <w:szCs w:val="24"/>
-        </w:rPr>
-      </w:pPr>
-      <w:r>
-        <w:rPr>
-          <w:rFonts w:ascii="Helvetica Neue" w:cs="Helvetica Neue" w:eastAsia="Helvetica Neue" w:hAnsi="Helvetica Neue"/>
-          <w:sz w:val="24"/>
-          <w:szCs w:val="24"/>
-          <w:rtl w:val="0"/>
-        </w:rPr>
-        <w:t xml:space="preserve">Full-Stack Software Engineer (Web, Mobile), DPD Framework — Apr 2025 </w:t>
-      </w:r>
-      <w:r>
-        <w:rPr>
-          <w:rFonts w:ascii="Helvetica Neue" w:cs="Helvetica Neue" w:eastAsia="Helvetica Neue" w:hAnsi="Helvetica Neue"/>
+          <w:rFonts w:ascii="Helvetica Neue Light" w:cs="Helvetica Neue Light" w:eastAsia="Helvetica Neue Light" w:hAnsi="Helvetica Neue Light"/>
+        </w:rPr>
+      </w:pPr>
+      <w:r>
+        <w:rPr>
+          <w:rtl w:val="0"/>
+        </w:rPr>
+      </w:r>
+    </w:p>
+    <w:p>
+      <w:pPr>
+        <w:spacing w:line="276" w:lineRule="auto"/>
+        <w:rPr>
+          <w:rFonts w:ascii="Helvetica Neue" w:cs="Helvetica Neue" w:eastAsia="Helvetica Neue" w:hAnsi="Helvetica Neue"/>
+          <w:sz w:val="24"/>
+          <w:szCs w:val="24"/>
+        </w:rPr>
+      </w:pPr>
+      <w:r>
+        <w:rPr>
+          <w:rtl w:val="0"/>
+        </w:rPr>
+      </w:r>
+    </w:p>
+    <w:p>
+      <w:pPr>
+        <w:spacing w:line="276" w:lineRule="auto"/>
+        <w:rPr>
+          <w:rFonts w:ascii="Helvetica Neue" w:cs="Helvetica Neue" w:eastAsia="Helvetica Neue" w:hAnsi="Helvetica Neue"/>
+          <w:sz w:val="24"/>
+          <w:szCs w:val="24"/>
+        </w:rPr>
+      </w:pPr>
+      <w:r>
+        <w:rPr>
+          <w:rtl w:val="0"/>
+        </w:rPr>
+      </w:r>
+    </w:p>
+    <w:p>
+      <w:pPr>
+        <w:spacing w:line="276" w:lineRule="auto"/>
+        <w:rPr>
+          <w:rFonts w:ascii="Helvetica Neue" w:cs="Helvetica Neue" w:eastAsia="Helvetica Neue" w:hAnsi="Helvetica Neue"/>
+          <w:sz w:val="24"/>
+          <w:szCs w:val="24"/>
+        </w:rPr>
+      </w:pPr>
+      <w:r>
+        <w:rPr>
+          <w:rtl w:val="0"/>
+        </w:rPr>
+      </w:r>
+    </w:p>
+    <w:p>
+      <w:pPr>
+        <w:spacing w:line="276" w:lineRule="auto"/>
+        <w:rPr>
+          <w:rFonts w:ascii="Helvetica Neue" w:cs="Helvetica Neue" w:eastAsia="Helvetica Neue" w:hAnsi="Helvetica Neue"/>
+          <w:sz w:val="24"/>
+          <w:szCs w:val="24"/>
+        </w:rPr>
+      </w:pPr>
+      <w:r>
+        <w:rPr>
+          <w:rtl w:val="0"/>
+        </w:rPr>
+      </w:r>
+    </w:p>
+    <w:p>
+      <w:pPr>
+        <w:spacing w:line="276" w:lineRule="auto"/>
+        <w:rPr>
+          <w:rFonts w:ascii="Helvetica Neue" w:cs="Helvetica Neue" w:eastAsia="Helvetica Neue" w:hAnsi="Helvetica Neue"/>
+          <w:sz w:val="24"/>
+          <w:szCs w:val="24"/>
+        </w:rPr>
+      </w:pPr>
+      <w:r>
+        <w:rPr>
+          <w:rtl w:val="0"/>
+        </w:rPr>
+      </w:r>
+    </w:p>
+    <w:p>
+      <w:pPr>
+        <w:spacing w:line="240" w:lineRule="auto"/>
+        <w:rPr>
+          <w:rFonts w:ascii="Helvetica Neue Light" w:cs="Helvetica Neue Light" w:eastAsia="Helvetica Neue Light" w:hAnsi="Helvetica Neue Light"/>
           <w:sz w:val="20"/>
           <w:szCs w:val="20"/>
-          <w:rtl w:val="0"/>
-        </w:rPr>
-        <w:t xml:space="preserve">•</w:t>
-      </w:r>
-      <w:r>
-        <w:rPr>
-          <w:rFonts w:ascii="Helvetica Neue" w:cs="Helvetica Neue" w:eastAsia="Helvetica Neue" w:hAnsi="Helvetica Neue"/>
-          <w:sz w:val="24"/>
-          <w:szCs w:val="24"/>
-          <w:rtl w:val="0"/>
-        </w:rPr>
-        <w:t xml:space="preserve"> Present</w:t>
-      </w:r>
-    </w:p>
-    <w:p>
-      <w:pPr>
-        <w:spacing w:line="240" w:lineRule="auto"/>
-        <w:rPr>
-          <w:rFonts w:ascii="Helvetica Neue" w:cs="Helvetica Neue" w:eastAsia="Helvetica Neue" w:hAnsi="Helvetica Neue"/>
-          <w:color w:val="434343"/>
-          <w:sz w:val="24"/>
-          <w:szCs w:val="24"/>
-        </w:rPr>
-      </w:pPr>
-      <w:r>
-        <w:rPr>
-          <w:rFonts w:ascii="Helvetica Neue" w:cs="Helvetica Neue" w:eastAsia="Helvetica Neue" w:hAnsi="Helvetica Neue"/>
-          <w:color w:val="434343"/>
-          <w:sz w:val="24"/>
-          <w:szCs w:val="24"/>
-          <w:rtl w:val="0"/>
-        </w:rPr>
-        <w:t xml:space="preserve">Contract Position</w:t>
-      </w:r>
-      <w:r>
-        <w:rPr>
-          <w:rtl w:val="0"/>
-        </w:rPr>
-      </w:r>
-    </w:p>
-    <w:p>
-      <w:pPr>
-        <w:spacing w:line="276" w:lineRule="auto"/>
-        <w:rPr>
-          <w:rFonts w:ascii="Helvetica Neue Light" w:cs="Helvetica Neue Light" w:eastAsia="Helvetica Neue Light" w:hAnsi="Helvetica Neue Light"/>
-          <w:color w:val="434343"/>
-        </w:rPr>
-      </w:pPr>
-      <w:r>
-        <w:rPr>
-          <w:rFonts w:ascii="Helvetica Neue Light" w:cs="Helvetica Neue Light" w:eastAsia="Helvetica Neue Light" w:hAnsi="Helvetica Neue Light"/>
-          <w:color w:val="434343"/>
-          <w:rtl w:val="0"/>
-        </w:rPr>
-        <w:t xml:space="preserve">• Implemented 3D custom user interfaces using React Native, Reanimated, and React Three Fiber</w:t>
-      </w:r>
-    </w:p>
-    <w:p>
-      <w:pPr>
-        <w:spacing w:line="276" w:lineRule="auto"/>
-        <w:rPr>
-          <w:rFonts w:ascii="Helvetica Neue Light" w:cs="Helvetica Neue Light" w:eastAsia="Helvetica Neue Light" w:hAnsi="Helvetica Neue Light"/>
-          <w:color w:val="434343"/>
-        </w:rPr>
-      </w:pPr>
-      <w:r>
-        <w:rPr>
-          <w:rFonts w:ascii="Helvetica Neue Light" w:cs="Helvetica Neue Light" w:eastAsia="Helvetica Neue Light" w:hAnsi="Helvetica Neue Light"/>
-          <w:color w:val="434343"/>
-          <w:rtl w:val="0"/>
-        </w:rPr>
-        <w:t xml:space="preserve">• Designed scalable Firebase data structures to support multi-tier professional organizations and fast data delivery</w:t>
-      </w:r>
-    </w:p>
-    <w:p>
-      <w:pPr>
-        <w:spacing w:line="276" w:lineRule="auto"/>
-        <w:rPr>
-          <w:rFonts w:ascii="Helvetica Neue Light" w:cs="Helvetica Neue Light" w:eastAsia="Helvetica Neue Light" w:hAnsi="Helvetica Neue Light"/>
-          <w:color w:val="434343"/>
-        </w:rPr>
-      </w:pPr>
-      <w:r>
-        <w:rPr>
-          <w:rFonts w:ascii="Helvetica Neue Light" w:cs="Helvetica Neue Light" w:eastAsia="Helvetica Neue Light" w:hAnsi="Helvetica Neue Light"/>
-          <w:color w:val="434343"/>
-          <w:rtl w:val="0"/>
-        </w:rPr>
-        <w:t xml:space="preserve">• Cut operational workload by 90%+ via automation pipelines and internal tooling</w:t>
-      </w:r>
-    </w:p>
-    <w:p>
-      <w:pPr>
-        <w:spacing w:line="240" w:lineRule="auto"/>
-        <w:rPr>
-          <w:rFonts w:ascii="Helvetica Neue Light" w:cs="Helvetica Neue Light" w:eastAsia="Helvetica Neue Light" w:hAnsi="Helvetica Neue Light"/>
-        </w:rPr>
-      </w:pPr>
-      <w:r>
-        <w:rPr>
-          <w:rtl w:val="0"/>
-        </w:rPr>
-      </w:r>
-    </w:p>
-    <w:p>
-      <w:pPr>
-        <w:spacing w:line="276" w:lineRule="auto"/>
-        <w:rPr>
-          <w:rFonts w:ascii="Helvetica Neue" w:cs="Helvetica Neue" w:eastAsia="Helvetica Neue" w:hAnsi="Helvetica Neue"/>
-          <w:sz w:val="24"/>
-          <w:szCs w:val="24"/>
-        </w:rPr>
-      </w:pPr>
-      <w:r>
-        <w:rPr>
-          <w:rtl w:val="0"/>
-        </w:rPr>
-      </w:r>
-    </w:p>
-    <w:p>
-      <w:pPr>
-        <w:spacing w:line="276" w:lineRule="auto"/>
-        <w:rPr>
-          <w:rFonts w:ascii="Helvetica Neue" w:cs="Helvetica Neue" w:eastAsia="Helvetica Neue" w:hAnsi="Helvetica Neue"/>
-          <w:sz w:val="24"/>
-          <w:szCs w:val="24"/>
-        </w:rPr>
-      </w:pPr>
-      <w:r>
-        <w:rPr>
-          <w:rtl w:val="0"/>
-        </w:rPr>
-      </w:r>
-    </w:p>
-    <w:p>
-      <w:pPr>
-        <w:spacing w:line="276" w:lineRule="auto"/>
-        <w:rPr>
-          <w:rFonts w:ascii="Helvetica Neue" w:cs="Helvetica Neue" w:eastAsia="Helvetica Neue" w:hAnsi="Helvetica Neue"/>
-          <w:sz w:val="24"/>
-          <w:szCs w:val="24"/>
-        </w:rPr>
-      </w:pPr>
-      <w:r>
-        <w:rPr>
-          <w:rtl w:val="0"/>
-        </w:rPr>
-      </w:r>
-    </w:p>
-    <w:p>
-      <w:pPr>
-        <w:spacing w:line="276" w:lineRule="auto"/>
-        <w:rPr>
-          <w:rFonts w:ascii="Helvetica Neue" w:cs="Helvetica Neue" w:eastAsia="Helvetica Neue" w:hAnsi="Helvetica Neue"/>
-          <w:sz w:val="24"/>
-          <w:szCs w:val="24"/>
-        </w:rPr>
-      </w:pPr>
-      <w:r>
-        <w:rPr>
-          <w:rtl w:val="0"/>
-        </w:rPr>
-      </w:r>
-    </w:p>
-    <w:p>
-      <w:pPr>
-        <w:spacing w:line="276" w:lineRule="auto"/>
-        <w:rPr>
-          <w:rFonts w:ascii="Helvetica Neue" w:cs="Helvetica Neue" w:eastAsia="Helvetica Neue" w:hAnsi="Helvetica Neue"/>
-          <w:sz w:val="24"/>
-          <w:szCs w:val="24"/>
-        </w:rPr>
-      </w:pPr>
-      <w:r>
-        <w:rPr>
-          <w:rtl w:val="0"/>
-        </w:rPr>
-      </w:r>
-    </w:p>
-    <w:p>
-      <w:pPr>
-        <w:spacing w:line="240" w:lineRule="auto"/>
-        <w:rPr>
-          <w:rFonts w:ascii="Helvetica Neue Light" w:cs="Helvetica Neue Light" w:eastAsia="Helvetica Neue Light" w:hAnsi="Helvetica Neue Light"/>
-          <w:sz w:val="20"/>
-          <w:szCs w:val="20"/>
-        </w:rPr>
-      </w:pPr>
-      <w:r>
-        <w:rPr>
-          <w:rFonts w:ascii="Helvetica Neue" w:cs="Helvetica Neue" w:eastAsia="Helvetica Neue" w:hAnsi="Helvetica Neue"/>
-          <w:b w:val="1"/>
-          <w:bCs w:val="1"/>
+        </w:rPr>
+      </w:pPr>
+      <w:r>
+        <w:rPr>
+          <w:rFonts w:ascii="Helvetica Neue" w:cs="Helvetica Neue" w:eastAsia="Helvetica Neue" w:hAnsi="Helvetica Neue"/>
           <w:color w:val="4a86e8"/>
           <w:sz w:val="48"/>
           <w:szCs w:val="48"/>
@@ -781,7 +787,7 @@
           <w:szCs w:val="24"/>
           <w:rtl w:val="0"/>
         </w:rPr>
-        <w:t xml:space="preserve">Full-Stack Software Engineer (Web, Backend), Fiverr — Dec 2023 </w:t>
+        <w:t xml:space="preserve">Full-Stack Software Engineer, Fiverr — Dec 2023 </w:t>
       </w:r>
       <w:r>
         <w:rPr>
@@ -880,7 +886,7 @@
           <w:szCs w:val="24"/>
           <w:rtl w:val="0"/>
         </w:rPr>
-        <w:t xml:space="preserve">Full-Stack Software Engineer (Web), Pre Framing Corp — Mar 2023 </w:t>
+        <w:t xml:space="preserve">Full-Stack Software Engineer, Pre Framing Corp — Mar 2023 </w:t>
       </w:r>
       <w:r>
         <w:rPr>
@@ -980,7 +986,7 @@
           <w:szCs w:val="24"/>
           <w:rtl w:val="0"/>
         </w:rPr>
-        <w:t xml:space="preserve">Full-Stack Software Engineer (Web), MinuteZero — Feb 2023 </w:t>
+        <w:t xml:space="preserve">Full-Stack Software Engineer, MinuteZero — Feb 2023 </w:t>
       </w:r>
       <w:r>
         <w:rPr>

</xml_diff>